<commit_message>
feat: add new music tracks and implement timing analysis feature
- Added five new music tracks: mirrorball-protocol.mp3, noise-cancel-heart.mp3, ryusei-brakeless.mp3, wataame-satellite.mp3, and zero-day-coronation.mp3.
- Introduced TimingAnalysis component to analyze player timing statistics, including average offset, consistency, and a histogram of hit timings.
- Implemented chart generation logic in chartBuilder.ts to create difficulty charts based on musical onsets.
- Created patterns for built-in synth arrangements in patterns.ts for various music styles.
- Developed music library service to load and parse generated songs from a manifest file, ensuring compatibility with the game's song metadata structure.
- Added timing service to compute timing statistics and suggest audio offsets for better player experience.
</commit_message>
<xml_diff>
--- a/public/docs/pulsebeat-plan.docx
+++ b/public/docs/pulsebeat-plan.docx
@@ -428,7 +428,7 @@
                 <w:sz w:val="19"/>
                 <w:szCs w:val="19"/>
               </w:rPr>
-              <w:t xml:space="preserve">1차(이미지 교체) 배포 완료 · 2차(화면 잘림/시작 불가 수정, 계획서 다운로드) 커밋 대기</w:t>
+              <w:t xml:space="preserve">1·2차 배포 완료 · 3차(Lyria 곡·박자 싱크·정확도·디자인·모바일) 커밋 대기</w:t>
             </w:r>
           </w:p>
         </w:tc>
@@ -5404,7 +5404,240 @@
         <w:keepNext/>
       </w:pPr>
       <w:r>
-        <w:t xml:space="preserve">9. 남은 작업 (다음 단계)</w:t>
+        <w:t xml:space="preserve">9. 3차 작업: Lyria 곡 · 박자 싱크 · 정확도 · 디자인 · 모바일</w:t>
+      </w:r>
+    </w:p>
+    <w:p>
+      <w:pPr>
+        <w:pStyle w:val="Heading2"/>
+        <w:keepNext/>
+      </w:pPr>
+      <w:r>
+        <w:t xml:space="preserve">노트 반복 문제 → 음악 기반 채보 생성기</w:t>
+      </w:r>
+    </w:p>
+    <w:p>
+      <w:pPr>
+        <w:pStyle w:val="ListParagraph"/>
+        <w:numPr>
+          <w:ilvl w:val="0"/>
+          <w:numId w:val="2"/>
+        </w:numPr>
+        <w:spacing w:after="60" w:line="290"/>
+      </w:pPr>
+      <w:r>
+        <w:t xml:space="preserve">기존 채보는 박자마다 같은 규칙을 반복해 2마디 단위로 70~85%가 똑같은 모양이었다. 새 생성기(</w:t>
+      </w:r>
+      <w:r>
+        <w:rPr>
+          <w:rFonts w:ascii="Consolas" w:cs="Consolas" w:eastAsia="Consolas" w:hAnsi="Consolas"/>
+          <w:color w:val="0E7490"/>
+          <w:sz w:val="19"/>
+          <w:szCs w:val="19"/>
+        </w:rPr>
+        <w:t xml:space="preserve">src/data/chartBuilder.ts</w:t>
+      </w:r>
+      <w:r>
+        <w:t xml:space="preserve">)는 실제 소리가 나는 타이밍에 노트를 두고, 음 높이를 따라 레인을 정하며, 2마디마다 배치를 바꾼다. 반복률은 전 곡·전 난이도 0%가 됐다.</w:t>
+      </w:r>
+    </w:p>
+    <w:p>
+      <w:pPr>
+        <w:pStyle w:val="ListParagraph"/>
+        <w:numPr>
+          <w:ilvl w:val="0"/>
+          <w:numId w:val="2"/>
+        </w:numPr>
+        <w:spacing w:after="60" w:line="290"/>
+      </w:pPr>
+      <w:r>
+        <w:t xml:space="preserve">난이도별 박자 격자: EASY는 정박만, NORMAL은 8분음표까지, HARD·EXPERT는 강한 소리가 있는 16분음표까지 쓴다.</w:t>
+      </w:r>
+    </w:p>
+    <w:p>
+      <w:pPr>
+        <w:pStyle w:val="Heading2"/>
+        <w:keepNext/>
+      </w:pPr>
+      <w:r>
+        <w:t xml:space="preserve">Lyria 3 Pro 오리지널 곡 8곡</w:t>
+      </w:r>
+    </w:p>
+    <w:p>
+      <w:pPr>
+        <w:pStyle w:val="ListParagraph"/>
+        <w:numPr>
+          <w:ilvl w:val="0"/>
+          <w:numId w:val="2"/>
+        </w:numPr>
+        <w:spacing w:after="60" w:line="290"/>
+      </w:pPr>
+      <w:r>
+        <w:t xml:space="preserve">여러 리듬게임의 곡 스타일을 조사해 8곡을 설계했다(일본어 보컬 4곡·연주곡 4곡, 길이 1:17~2:38, BPM 92~184).</w:t>
+      </w:r>
+    </w:p>
+    <w:p>
+      <w:pPr>
+        <w:pStyle w:val="ListParagraph"/>
+        <w:numPr>
+          <w:ilvl w:val="0"/>
+          <w:numId w:val="2"/>
+        </w:numPr>
+        <w:spacing w:after="60" w:line="290"/>
+      </w:pPr>
+      <w:r>
+        <w:t xml:space="preserve">Google Cloud 크레딧으로 Vertex AI(location global, Interactions API)에서 lyria-3-pro-preview로 생성했다(</w:t>
+      </w:r>
+      <w:r>
+        <w:rPr>
+          <w:rFonts w:ascii="Consolas" w:cs="Consolas" w:eastAsia="Consolas" w:hAnsi="Consolas"/>
+          <w:color w:val="0E7490"/>
+          <w:sz w:val="19"/>
+          <w:szCs w:val="19"/>
+        </w:rPr>
+        <w:t xml:space="preserve">node music/generate.mjs --vertex</w:t>
+      </w:r>
+      <w:r>
+        <w:t xml:space="preserve">).</w:t>
+      </w:r>
+    </w:p>
+    <w:p>
+      <w:pPr>
+        <w:pStyle w:val="ListParagraph"/>
+        <w:numPr>
+          <w:ilvl w:val="0"/>
+          <w:numId w:val="2"/>
+        </w:numPr>
+        <w:spacing w:after="60" w:line="290"/>
+      </w:pPr>
+      <w:r>
+        <w:t xml:space="preserve">음원 분석(</w:t>
+      </w:r>
+      <w:r>
+        <w:rPr>
+          <w:rFonts w:ascii="Consolas" w:cs="Consolas" w:eastAsia="Consolas" w:hAnsi="Consolas"/>
+          <w:color w:val="0E7490"/>
+          <w:sz w:val="19"/>
+          <w:szCs w:val="19"/>
+        </w:rPr>
+        <w:t xml:space="preserve">music/chart.mjs</w:t>
+      </w:r>
+      <w:r>
+        <w:t xml:space="preserve">)으로 템포와 박 위치를 찾아 4개 난이도 채보를 만든다. 템포가 흔들린 2곡은 다시 생성해 박자 오차 ±3ms 이내의 결과를 골랐다.</w:t>
+      </w:r>
+    </w:p>
+    <w:p>
+      <w:pPr>
+        <w:pStyle w:val="Heading2"/>
+        <w:keepNext/>
+      </w:pPr>
+      <w:r>
+        <w:t xml:space="preserve">박자 싱크</w:t>
+      </w:r>
+    </w:p>
+    <w:p>
+      <w:pPr>
+        <w:pStyle w:val="ListParagraph"/>
+        <w:numPr>
+          <w:ilvl w:val="0"/>
+          <w:numId w:val="2"/>
+        </w:numPr>
+        <w:spacing w:after="60" w:line="290"/>
+      </w:pPr>
+      <w:r>
+        <w:t xml:space="preserve">오디오 출력 지연(이 PC 약 50ms, 블루투스는 200ms 이상)만큼 노트가 소리보다 먼저 도착하던 문제를 getOutputTimestamp()로 실제 스피커 시각을 기준으로 계산해 해결했다.</w:t>
+      </w:r>
+    </w:p>
+    <w:p>
+      <w:pPr>
+        <w:pStyle w:val="ListParagraph"/>
+        <w:numPr>
+          <w:ilvl w:val="0"/>
+          <w:numId w:val="2"/>
+        </w:numPr>
+        <w:spacing w:after="60" w:line="290"/>
+      </w:pPr>
+      <w:r>
+        <w:t xml:space="preserve">키 입력 판정도 화면 갱신 주기 대신 누른 순간의 오디오 시각을 쓴다(최대 16ms 개선).</w:t>
+      </w:r>
+    </w:p>
+    <w:p>
+      <w:pPr>
+        <w:pStyle w:val="Heading2"/>
+        <w:keepNext/>
+      </w:pPr>
+      <w:r>
+        <w:t xml:space="preserve">정확도 기능</w:t>
+      </w:r>
+    </w:p>
+    <w:p>
+      <w:pPr>
+        <w:pStyle w:val="ListParagraph"/>
+        <w:numPr>
+          <w:ilvl w:val="0"/>
+          <w:numId w:val="2"/>
+        </w:numPr>
+        <w:spacing w:after="60" w:line="290"/>
+      </w:pPr>
+      <w:r>
+        <w:t xml:space="preserve">플레이 중: 정확도, 판정 개수(PF/GR/GD/MS), 평균 오차(ms), 판정 글자 아래 오차 ms, 판정선 아래 타이밍 막대, 곡 진행 막대.</w:t>
+      </w:r>
+    </w:p>
+    <w:p>
+      <w:pPr>
+        <w:pStyle w:val="ListParagraph"/>
+        <w:numPr>
+          <w:ilvl w:val="0"/>
+          <w:numId w:val="2"/>
+        </w:numPr>
+        <w:spacing w:after="60" w:line="290"/>
+      </w:pPr>
+      <w:r>
+        <w:t xml:space="preserve">결과 화면: 평균 오차, 편차, 오차 분포 그래프, 추천 오프셋 원클릭 적용.</w:t>
+      </w:r>
+    </w:p>
+    <w:p>
+      <w:pPr>
+        <w:pStyle w:val="Heading2"/>
+        <w:keepNext/>
+      </w:pPr>
+      <w:r>
+        <w:t xml:space="preserve">디자인 · 모바일</w:t>
+      </w:r>
+    </w:p>
+    <w:p>
+      <w:pPr>
+        <w:pStyle w:val="ListParagraph"/>
+        <w:numPr>
+          <w:ilvl w:val="0"/>
+          <w:numId w:val="2"/>
+        </w:numPr>
+        <w:spacing w:after="60" w:line="290"/>
+      </w:pPr>
+      <w:r>
+        <w:t xml:space="preserve">공통 유리 패널·네온 스타일로 HUD·곡 선택·모달·결과 화면을 통일하고, 상단 메뉴에 로고 이미지를 넣었다. 노트 칸을 반투명하게 해 스테이지 배경이 보이게 했다.</w:t>
+      </w:r>
+    </w:p>
+    <w:p>
+      <w:pPr>
+        <w:pStyle w:val="ListParagraph"/>
+        <w:numPr>
+          <w:ilvl w:val="0"/>
+          <w:numId w:val="2"/>
+        </w:numPr>
+        <w:spacing w:after="60" w:line="290"/>
+      </w:pPr>
+      <w:r>
+        <w:t xml:space="preserve">모바일: 화면 아래쪽 절반을 4개 레인 터치 영역으로(멀티터치·슬라이드), 첫 터치로 오디오 잠금 해제, 앱 전환 시 자동 일시정지, 스크롤·확대 방지, 캔버스 해상도 2배 제한.</w:t>
+      </w:r>
+    </w:p>
+    <w:p>
+      <w:pPr>
+        <w:pStyle w:val="Heading1"/>
+        <w:keepNext/>
+      </w:pPr>
+      <w:r>
+        <w:t xml:space="preserve">10. 남은 작업 (다음 단계)</w:t>
       </w:r>
     </w:p>
     <w:p>
@@ -5417,7 +5650,7 @@
         <w:spacing w:after="60" w:line="290"/>
       </w:pPr>
       <w:r>
-        <w:t xml:space="preserve">2차 수정 사항을 커밋한다. 권장 메시지: </w:t>
+        <w:t xml:space="preserve">3차 변경 사항을 커밋·push한다. 권장 메시지: </w:t>
       </w:r>
       <w:r>
         <w:rPr>
@@ -5426,7 +5659,7 @@
           <w:sz w:val="19"/>
           <w:szCs w:val="19"/>
         </w:rPr>
-        <w:t xml:space="preserve">fix: 화면 잘림으로 게임 시작 불가 문제 수정 및 계획서 다운로드 추가</w:t>
+        <w:t xml:space="preserve">feat: Lyria 3 Pro 곡 8곡, 박자 싱크·정확도 분석, 디자인·모바일 개선</w:t>
       </w:r>
     </w:p>
     <w:p>
@@ -5439,20 +5672,7 @@
         <w:spacing w:after="60" w:line="290"/>
       </w:pPr>
       <w:r>
-        <w:t xml:space="preserve">main 브랜치에 push하면 Vercel이 자동 배포한다 (1차 배포에서 자동 배포 확인됨).</w:t>
-      </w:r>
-    </w:p>
-    <w:p>
-      <w:pPr>
-        <w:pStyle w:val="ListParagraph"/>
-        <w:numPr>
-          <w:ilvl w:val="0"/>
-          <w:numId w:val="4"/>
-        </w:numPr>
-        <w:spacing w:after="60" w:line="290"/>
-      </w:pPr>
-      <w:r>
-        <w:t xml:space="preserve">배포 후 실제 휴대폰과 노트북에서 곡 선택 → 플레이 → 결과까지 한 판 진행해 본다.</w:t>
+        <w:t xml:space="preserve">배포 후 실제 휴대폰에서 터치 플레이와 소리 싱크를 확인하고, 필요하면 결과 화면의 추천 오프셋을 적용한다.</w:t>
       </w:r>
     </w:p>
     <w:p>
@@ -5461,7 +5681,7 @@
         <w:keepNext/>
       </w:pPr>
       <w:r>
-        <w:t xml:space="preserve">10. 향후 개선 제안</w:t>
+        <w:t xml:space="preserve">11. 향후 개선 제안</w:t>
       </w:r>
     </w:p>
     <w:p>

</xml_diff>

<commit_message>
Add hit sound effect file to public sfx directory
</commit_message>
<xml_diff>
--- a/public/docs/pulsebeat-plan.docx
+++ b/public/docs/pulsebeat-plan.docx
@@ -428,7 +428,7 @@
                 <w:sz w:val="19"/>
                 <w:szCs w:val="19"/>
               </w:rPr>
-              <w:t xml:space="preserve">1·2차 배포 완료 · 3차(Lyria 곡·박자 싱크·정확도·디자인·모바일) 커밋 대기</w:t>
+              <w:t xml:space="preserve">3차까지 배포 완료 · 4차(타격음·클리어 효과음·연주곡 10곡 추가) 커밋 대기</w:t>
             </w:r>
           </w:p>
         </w:tc>
@@ -5629,6 +5629,67 @@
       </w:pPr>
       <w:r>
         <w:t xml:space="preserve">모바일: 화면 아래쪽 절반을 4개 레인 터치 영역으로(멀티터치·슬라이드), 첫 터치로 오디오 잠금 해제, 앱 전환 시 자동 일시정지, 스크롤·확대 방지, 캔버스 해상도 2배 제한.</w:t>
+      </w:r>
+    </w:p>
+    <w:p>
+      <w:pPr>
+        <w:pStyle w:val="Heading2"/>
+        <w:keepNext/>
+      </w:pPr>
+      <w:r>
+        <w:t xml:space="preserve">4차: 타격음 · 클리어 효과음 · 곡 구성</w:t>
+      </w:r>
+    </w:p>
+    <w:p>
+      <w:pPr>
+        <w:pStyle w:val="ListParagraph"/>
+        <w:numPr>
+          <w:ilvl w:val="0"/>
+          <w:numId w:val="2"/>
+        </w:numPr>
+        <w:spacing w:after="60" w:line="290"/>
+      </w:pPr>
+      <w:r>
+        <w:t xml:space="preserve">레인마다 음높이가 다른 신디사이저 타격음을 없애고, 음정 없는 짧은 타악기 샘플(public/sfx/hit.wav) 하나로 바꿨다. 싱크 보정 메트로놈도 같은 소리를 쓴다.</w:t>
+      </w:r>
+    </w:p>
+    <w:p>
+      <w:pPr>
+        <w:pStyle w:val="ListParagraph"/>
+        <w:numPr>
+          <w:ilvl w:val="0"/>
+          <w:numId w:val="2"/>
+        </w:numPr>
+        <w:spacing w:after="60" w:line="290"/>
+      </w:pPr>
+      <w:r>
+        <w:t xml:space="preserve">STAGE CLEAR 이상이면 결과 화면에서 Lyria 클립으로 만든 5초 팡파레(public/sfx/clear.wav)가 울린다. 두 효과음은 node music/sfx.mjs로 다시 만들 수 있다.</w:t>
+      </w:r>
+    </w:p>
+    <w:p>
+      <w:pPr>
+        <w:pStyle w:val="ListParagraph"/>
+        <w:numPr>
+          <w:ilvl w:val="0"/>
+          <w:numId w:val="2"/>
+        </w:numPr>
+        <w:spacing w:after="60" w:line="290"/>
+      </w:pPr>
+      <w:r>
+        <w:t xml:space="preserve">신디사이저로만 만든 기본 4곡은 곡 목록에서 뺐다(생성곡을 불러오지 못할 때만 예비로 표시).</w:t>
+      </w:r>
+    </w:p>
+    <w:p>
+      <w:pPr>
+        <w:pStyle w:val="ListParagraph"/>
+        <w:numPr>
+          <w:ilvl w:val="0"/>
+          <w:numId w:val="2"/>
+        </w:numPr>
+        <w:spacing w:after="60" w:line="290"/>
+      </w:pPr>
+      <w:r>
+        <w:t xml:space="preserve">연주곡 10곡을 추가했다: 칠합, 칩튠, 재즈 펑크, 글리치 합, 하드스타일, 리퀴드 DnB, 해피 하드코어, 트랜스, 멜로딕 덥스텝, 매스록(1:08~2:51). 곡은 총 18곡(보컬 4, 연주 14)이다.</w:t>
       </w:r>
     </w:p>
     <w:p>

</xml_diff>

<commit_message>
feat: add title theme music and selection sound effect; update UI for song selection feedback
</commit_message>
<xml_diff>
--- a/public/docs/pulsebeat-plan.docx
+++ b/public/docs/pulsebeat-plan.docx
@@ -5690,6 +5690,32 @@
       </w:pPr>
       <w:r>
         <w:t xml:space="preserve">연주곡 10곡을 추가했다: 칠합, 칩튠, 재즈 펑크, 글리치 합, 하드스타일, 리퀴드 DnB, 해피 하드코어, 트랜스, 멜로딕 덥스텝, 매스록(1:08~2:51). 곡은 총 18곡(보컬 4, 연주 14)이다.</w:t>
+      </w:r>
+    </w:p>
+    <w:p>
+      <w:pPr>
+        <w:pStyle w:val="ListParagraph"/>
+        <w:numPr>
+          <w:ilvl w:val="0"/>
+          <w:numId w:val="2"/>
+        </w:numPr>
+        <w:spacing w:after="60" w:line="290"/>
+      </w:pPr>
+      <w:r>
+        <w:t xml:space="preserve">타이틀 화면에 Lyria 3 Pro로 만든 테마곡(public/music/title-theme.mp3)을 넣었다. 끝부분 2초를 겹쳐 끊김 없이 반복되고, 음소거 버튼과 "화면을 누르면 음악이 재생돼요" 안내가 있다. 타이틀은 이제 Enter·Space·시작 버튼으로만 넘어간다.</w:t>
+      </w:r>
+    </w:p>
+    <w:p>
+      <w:pPr>
+        <w:pStyle w:val="ListParagraph"/>
+        <w:numPr>
+          <w:ilvl w:val="0"/>
+          <w:numId w:val="2"/>
+        </w:numPr>
+        <w:spacing w:after="60" w:line="290"/>
+      </w:pPr>
+      <w:r>
+        <w:t xml:space="preserve">곡 선택 화면에서 곡이나 난이도를 바꾸면 짧은 선택 효과음(public/sfx/select.wav)이 울린다.</w:t>
       </w:r>
     </w:p>
     <w:p>

</xml_diff>